<commit_message>
Bütün belge kartlarında açıklamalar 2-3 kelimelik ifadelere indirildi
</commit_message>
<xml_diff>
--- a/dosyalar/calisma-kagitlari/8-sinif/arapca-8-dilbilgisi-ozeti.docx
+++ b/dosyalar/calisma-kagitlari/8-sinif/arapca-8-dilbilgisi-ozeti.docx
@@ -312,7 +312,7 @@
     </w:p>
     <w:tbl>
       <w:tblPr>
-        <w:bidiVisual w:val="false"/>
+        <w:bidiVisual/>
         <w:tblW w:type="dxa" w:w="10546"/>
         <w:tblBorders>
           <w:top w:val="none" w:color="FFFFFF" w:sz="0"/>
@@ -565,14 +565,27 @@
             <w:r>
               <w:rPr>
                 <w:rFonts w:ascii="Arakom" w:cs="Arakom" w:eastAsia="Arakom" w:hAnsi="Arakom"/>
-                <w:b w:val="false"/>
-                <w:color w:val="000000"/>
+                <w:b/>
+                <w:bCs/>
+                <w:color w:val="1F4E79"/>
                 <w:sz w:val="26"/>
                 <w:szCs w:val="26"/>
                 <w:rtl/>
                 <w:lang w:bidi="ar-SA"/>
               </w:rPr>
-              <w:t xml:space="preserve">أَنا أَخْتارُ نادي الرِّياضَة لِأَنَّني أُحِبُّ الرِّياضَة.</w:t>
+              <w:t xml:space="preserve">أَنا</w:t>
+            </w:r>
+            <w:r>
+              <w:rPr>
+                <w:rFonts w:ascii="Arakom" w:cs="Arakom" w:eastAsia="Arakom" w:hAnsi="Arakom"/>
+                <w:b w:val="false"/>
+                <w:color w:val="000000"/>
+                <w:sz w:val="26"/>
+                <w:szCs w:val="26"/>
+                <w:rtl/>
+                <w:lang w:bidi="ar-SA"/>
+              </w:rPr>
+              <w:t xml:space="preserve"> أَخْتارُ نادي الرِّياضَة لِأَنَّني أُحِبُّ الرِّياضَة.</w:t>
             </w:r>
           </w:p>
           <w:p>
@@ -709,14 +722,27 @@
             <w:r>
               <w:rPr>
                 <w:rFonts w:ascii="Arakom" w:cs="Arakom" w:eastAsia="Arakom" w:hAnsi="Arakom"/>
-                <w:b w:val="false"/>
-                <w:color w:val="000000"/>
+                <w:b/>
+                <w:bCs/>
+                <w:color w:val="1F4E79"/>
                 <w:sz w:val="26"/>
                 <w:szCs w:val="26"/>
                 <w:rtl/>
                 <w:lang w:bidi="ar-SA"/>
               </w:rPr>
-              <w:t xml:space="preserve">نَحْنُ نَذْهَبُ إلى المَسْرَح الكَبير.</w:t>
+              <w:t xml:space="preserve">نَحْنُ</w:t>
+            </w:r>
+            <w:r>
+              <w:rPr>
+                <w:rFonts w:ascii="Arakom" w:cs="Arakom" w:eastAsia="Arakom" w:hAnsi="Arakom"/>
+                <w:b w:val="false"/>
+                <w:color w:val="000000"/>
+                <w:sz w:val="26"/>
+                <w:szCs w:val="26"/>
+                <w:rtl/>
+                <w:lang w:bidi="ar-SA"/>
+              </w:rPr>
+              <w:t xml:space="preserve"> نَذْهَبُ إلى المَسْرَح الكَبير.</w:t>
             </w:r>
           </w:p>
           <w:p>
@@ -853,14 +879,27 @@
             <w:r>
               <w:rPr>
                 <w:rFonts w:ascii="Arakom" w:cs="Arakom" w:eastAsia="Arakom" w:hAnsi="Arakom"/>
-                <w:b w:val="false"/>
-                <w:color w:val="000000"/>
+                <w:b/>
+                <w:bCs/>
+                <w:color w:val="1F4E79"/>
                 <w:sz w:val="26"/>
                 <w:szCs w:val="26"/>
                 <w:rtl/>
                 <w:lang w:bidi="ar-SA"/>
               </w:rPr>
-              <w:t xml:space="preserve">أَنْتَ تُحِبُّ الموسيقى، لِذَلِكَ تَخْتارُ نادي الموسيقى.</w:t>
+              <w:t xml:space="preserve">أَنْتَ</w:t>
+            </w:r>
+            <w:r>
+              <w:rPr>
+                <w:rFonts w:ascii="Arakom" w:cs="Arakom" w:eastAsia="Arakom" w:hAnsi="Arakom"/>
+                <w:b w:val="false"/>
+                <w:color w:val="000000"/>
+                <w:sz w:val="26"/>
+                <w:szCs w:val="26"/>
+                <w:rtl/>
+                <w:lang w:bidi="ar-SA"/>
+              </w:rPr>
+              <w:t xml:space="preserve"> تُحِبُّ الموسيقى، لِذَلِكَ تَخْتارُ نادي الموسيقى.</w:t>
             </w:r>
           </w:p>
           <w:p>
@@ -1004,7 +1043,32 @@
                 <w:rtl/>
                 <w:lang w:bidi="ar-SA"/>
               </w:rPr>
-              <w:t xml:space="preserve">هَل أنتِ مُمَثِّلَة؟</w:t>
+              <w:t xml:space="preserve">هَل </w:t>
+            </w:r>
+            <w:r>
+              <w:rPr>
+                <w:rFonts w:ascii="Arakom" w:cs="Arakom" w:eastAsia="Arakom" w:hAnsi="Arakom"/>
+                <w:b/>
+                <w:bCs/>
+                <w:color w:val="1F4E79"/>
+                <w:sz w:val="26"/>
+                <w:szCs w:val="26"/>
+                <w:rtl/>
+                <w:lang w:bidi="ar-SA"/>
+              </w:rPr>
+              <w:t xml:space="preserve">أنتِ</w:t>
+            </w:r>
+            <w:r>
+              <w:rPr>
+                <w:rFonts w:ascii="Arakom" w:cs="Arakom" w:eastAsia="Arakom" w:hAnsi="Arakom"/>
+                <w:b w:val="false"/>
+                <w:color w:val="000000"/>
+                <w:sz w:val="26"/>
+                <w:szCs w:val="26"/>
+                <w:rtl/>
+                <w:lang w:bidi="ar-SA"/>
+              </w:rPr>
+              <w:t xml:space="preserve"> مُمَثِّلَة؟</w:t>
             </w:r>
           </w:p>
           <w:p>
@@ -1141,14 +1205,27 @@
             <w:r>
               <w:rPr>
                 <w:rFonts w:ascii="Arakom" w:cs="Arakom" w:eastAsia="Arakom" w:hAnsi="Arakom"/>
-                <w:b w:val="false"/>
-                <w:color w:val="000000"/>
+                <w:b/>
+                <w:bCs/>
+                <w:color w:val="1F4E79"/>
                 <w:sz w:val="26"/>
                 <w:szCs w:val="26"/>
                 <w:rtl/>
                 <w:lang w:bidi="ar-SA"/>
               </w:rPr>
-              <w:t xml:space="preserve">هُوَ يُحِبُّ الرَّسْم، لَكِنْ يَخْتارُ نادي النَّظافَة.</w:t>
+              <w:t xml:space="preserve">هُوَ</w:t>
+            </w:r>
+            <w:r>
+              <w:rPr>
+                <w:rFonts w:ascii="Arakom" w:cs="Arakom" w:eastAsia="Arakom" w:hAnsi="Arakom"/>
+                <w:b w:val="false"/>
+                <w:color w:val="000000"/>
+                <w:sz w:val="26"/>
+                <w:szCs w:val="26"/>
+                <w:rtl/>
+                <w:lang w:bidi="ar-SA"/>
+              </w:rPr>
+              <w:t xml:space="preserve"> يُحِبُّ الرَّسْم، لَكِنْ يَخْتارُ نادي النَّظافَة.</w:t>
             </w:r>
           </w:p>
           <w:p>
@@ -1285,14 +1362,27 @@
             <w:r>
               <w:rPr>
                 <w:rFonts w:ascii="Arakom" w:cs="Arakom" w:eastAsia="Arakom" w:hAnsi="Arakom"/>
-                <w:b w:val="false"/>
-                <w:color w:val="000000"/>
+                <w:b/>
+                <w:bCs/>
+                <w:color w:val="1F4E79"/>
                 <w:sz w:val="26"/>
                 <w:szCs w:val="26"/>
                 <w:rtl/>
                 <w:lang w:bidi="ar-SA"/>
               </w:rPr>
-              <w:t xml:space="preserve">هِيَ تُحِبُّ الرِّياضَة، لَكِنْ تَخْتارُ نادي المَسْرَحِيَّة.</w:t>
+              <w:t xml:space="preserve">هِيَ</w:t>
+            </w:r>
+            <w:r>
+              <w:rPr>
+                <w:rFonts w:ascii="Arakom" w:cs="Arakom" w:eastAsia="Arakom" w:hAnsi="Arakom"/>
+                <w:b w:val="false"/>
+                <w:color w:val="000000"/>
+                <w:sz w:val="26"/>
+                <w:szCs w:val="26"/>
+                <w:rtl/>
+                <w:lang w:bidi="ar-SA"/>
+              </w:rPr>
+              <w:t xml:space="preserve"> تُحِبُّ الرِّياضَة، لَكِنْ تَخْتارُ نادي المَسْرَحِيَّة.</w:t>
             </w:r>
           </w:p>
           <w:p>
@@ -1483,7 +1573,7 @@
     </w:p>
     <w:tbl>
       <w:tblPr>
-        <w:bidiVisual w:val="false"/>
+        <w:bidiVisual/>
         <w:tblW w:type="dxa" w:w="10546"/>
         <w:tblBorders>
           <w:top w:val="none" w:color="FFFFFF" w:sz="0"/>
@@ -1614,15 +1704,27 @@
             <w:r>
               <w:rPr>
                 <w:rFonts w:ascii="Arakom" w:cs="Arakom" w:eastAsia="Arakom" w:hAnsi="Arakom"/>
-                <w:b/>
-                <w:bCs/>
+                <w:b w:val="false"/>
                 <w:color w:val="000000"/>
                 <w:sz w:val="30"/>
                 <w:szCs w:val="30"/>
                 <w:rtl/>
                 <w:lang w:bidi="ar-SA"/>
               </w:rPr>
-              <w:t xml:space="preserve">صَديقي</w:t>
+              <w:t xml:space="preserve">صَديق</w:t>
+            </w:r>
+            <w:r>
+              <w:rPr>
+                <w:rFonts w:ascii="Arakom" w:cs="Arakom" w:eastAsia="Arakom" w:hAnsi="Arakom"/>
+                <w:b/>
+                <w:bCs/>
+                <w:color w:val="1F4E79"/>
+                <w:sz w:val="30"/>
+                <w:szCs w:val="30"/>
+                <w:rtl/>
+                <w:lang w:bidi="ar-SA"/>
+              </w:rPr>
+              <w:t xml:space="preserve">ي</w:t>
             </w:r>
             <w:r>
               <w:rPr>
@@ -1639,15 +1741,27 @@
             <w:r>
               <w:rPr>
                 <w:rFonts w:ascii="Arakom" w:cs="Arakom" w:eastAsia="Arakom" w:hAnsi="Arakom"/>
-                <w:b/>
-                <w:bCs/>
+                <w:b w:val="false"/>
                 <w:color w:val="000000"/>
                 <w:sz w:val="30"/>
                 <w:szCs w:val="30"/>
                 <w:rtl/>
                 <w:lang w:bidi="ar-SA"/>
               </w:rPr>
-              <w:t xml:space="preserve">مَدْرَسَتي</w:t>
+              <w:t xml:space="preserve">مَدْرَسَت</w:t>
+            </w:r>
+            <w:r>
+              <w:rPr>
+                <w:rFonts w:ascii="Arakom" w:cs="Arakom" w:eastAsia="Arakom" w:hAnsi="Arakom"/>
+                <w:b/>
+                <w:bCs/>
+                <w:color w:val="1F4E79"/>
+                <w:sz w:val="30"/>
+                <w:szCs w:val="30"/>
+                <w:rtl/>
+                <w:lang w:bidi="ar-SA"/>
+              </w:rPr>
+              <w:t xml:space="preserve">ي</w:t>
             </w:r>
           </w:p>
           <w:p>
@@ -1779,15 +1893,27 @@
             <w:r>
               <w:rPr>
                 <w:rFonts w:ascii="Arakom" w:cs="Arakom" w:eastAsia="Arakom" w:hAnsi="Arakom"/>
-                <w:b/>
-                <w:bCs/>
+                <w:b w:val="false"/>
                 <w:color w:val="000000"/>
                 <w:sz w:val="30"/>
                 <w:szCs w:val="30"/>
                 <w:rtl/>
                 <w:lang w:bidi="ar-SA"/>
               </w:rPr>
-              <w:t xml:space="preserve">مِهْنَتُكِ</w:t>
+              <w:t xml:space="preserve">مِهْنَتُ</w:t>
+            </w:r>
+            <w:r>
+              <w:rPr>
+                <w:rFonts w:ascii="Arakom" w:cs="Arakom" w:eastAsia="Arakom" w:hAnsi="Arakom"/>
+                <w:b/>
+                <w:bCs/>
+                <w:color w:val="1F4E79"/>
+                <w:sz w:val="30"/>
+                <w:szCs w:val="30"/>
+                <w:rtl/>
+                <w:lang w:bidi="ar-SA"/>
+              </w:rPr>
+              <w:t xml:space="preserve">كِ</w:t>
             </w:r>
           </w:p>
           <w:p>
@@ -1924,15 +2050,27 @@
             <w:r>
               <w:rPr>
                 <w:rFonts w:ascii="Arakom" w:cs="Arakom" w:eastAsia="Arakom" w:hAnsi="Arakom"/>
-                <w:b/>
-                <w:bCs/>
+                <w:b w:val="false"/>
                 <w:color w:val="000000"/>
                 <w:sz w:val="30"/>
                 <w:szCs w:val="30"/>
                 <w:rtl/>
                 <w:lang w:bidi="ar-SA"/>
               </w:rPr>
-              <w:t xml:space="preserve">صَفُّنا</w:t>
+              <w:t xml:space="preserve">صَفُّ</w:t>
+            </w:r>
+            <w:r>
+              <w:rPr>
+                <w:rFonts w:ascii="Arakom" w:cs="Arakom" w:eastAsia="Arakom" w:hAnsi="Arakom"/>
+                <w:b/>
+                <w:bCs/>
+                <w:color w:val="1F4E79"/>
+                <w:sz w:val="30"/>
+                <w:szCs w:val="30"/>
+                <w:rtl/>
+                <w:lang w:bidi="ar-SA"/>
+              </w:rPr>
+              <w:t xml:space="preserve">نا</w:t>
             </w:r>
             <w:r>
               <w:rPr>
@@ -1949,15 +2087,27 @@
             <w:r>
               <w:rPr>
                 <w:rFonts w:ascii="Arakom" w:cs="Arakom" w:eastAsia="Arakom" w:hAnsi="Arakom"/>
-                <w:b/>
-                <w:bCs/>
+                <w:b w:val="false"/>
                 <w:color w:val="000000"/>
                 <w:sz w:val="30"/>
                 <w:szCs w:val="30"/>
                 <w:rtl/>
                 <w:lang w:bidi="ar-SA"/>
               </w:rPr>
-              <w:t xml:space="preserve">مُعَلِّمُنا</w:t>
+              <w:t xml:space="preserve">مُعَلِّمُ</w:t>
+            </w:r>
+            <w:r>
+              <w:rPr>
+                <w:rFonts w:ascii="Arakom" w:cs="Arakom" w:eastAsia="Arakom" w:hAnsi="Arakom"/>
+                <w:b/>
+                <w:bCs/>
+                <w:color w:val="1F4E79"/>
+                <w:sz w:val="30"/>
+                <w:szCs w:val="30"/>
+                <w:rtl/>
+                <w:lang w:bidi="ar-SA"/>
+              </w:rPr>
+              <w:t xml:space="preserve">نا</w:t>
             </w:r>
           </w:p>
           <w:p>
@@ -2089,15 +2239,27 @@
             <w:r>
               <w:rPr>
                 <w:rFonts w:ascii="Arakom" w:cs="Arakom" w:eastAsia="Arakom" w:hAnsi="Arakom"/>
-                <w:b/>
-                <w:bCs/>
+                <w:b w:val="false"/>
                 <w:color w:val="000000"/>
                 <w:sz w:val="30"/>
                 <w:szCs w:val="30"/>
                 <w:rtl/>
                 <w:lang w:bidi="ar-SA"/>
               </w:rPr>
-              <w:t xml:space="preserve">سَتَجِدُهُ</w:t>
+              <w:t xml:space="preserve">سَتَجِدُ</w:t>
+            </w:r>
+            <w:r>
+              <w:rPr>
+                <w:rFonts w:ascii="Arakom" w:cs="Arakom" w:eastAsia="Arakom" w:hAnsi="Arakom"/>
+                <w:b/>
+                <w:bCs/>
+                <w:color w:val="1F4E79"/>
+                <w:sz w:val="30"/>
+                <w:szCs w:val="30"/>
+                <w:rtl/>
+                <w:lang w:bidi="ar-SA"/>
+              </w:rPr>
+              <w:t xml:space="preserve">هُ</w:t>
             </w:r>
           </w:p>
           <w:p>
@@ -2234,15 +2396,27 @@
             <w:r>
               <w:rPr>
                 <w:rFonts w:ascii="Arakom" w:cs="Arakom" w:eastAsia="Arakom" w:hAnsi="Arakom"/>
-                <w:b/>
-                <w:bCs/>
+                <w:b w:val="false"/>
                 <w:color w:val="000000"/>
                 <w:sz w:val="30"/>
                 <w:szCs w:val="30"/>
                 <w:rtl/>
                 <w:lang w:bidi="ar-SA"/>
               </w:rPr>
-              <w:t xml:space="preserve">عُمْرُكَ</w:t>
+              <w:t xml:space="preserve">عُمْرُ</w:t>
+            </w:r>
+            <w:r>
+              <w:rPr>
+                <w:rFonts w:ascii="Arakom" w:cs="Arakom" w:eastAsia="Arakom" w:hAnsi="Arakom"/>
+                <w:b/>
+                <w:bCs/>
+                <w:color w:val="1F4E79"/>
+                <w:sz w:val="30"/>
+                <w:szCs w:val="30"/>
+                <w:rtl/>
+                <w:lang w:bidi="ar-SA"/>
+              </w:rPr>
+              <w:t xml:space="preserve">كَ</w:t>
             </w:r>
             <w:r>
               <w:rPr>
@@ -2259,15 +2433,27 @@
             <w:r>
               <w:rPr>
                 <w:rFonts w:ascii="Arakom" w:cs="Arakom" w:eastAsia="Arakom" w:hAnsi="Arakom"/>
-                <w:b/>
-                <w:bCs/>
+                <w:b w:val="false"/>
                 <w:color w:val="000000"/>
                 <w:sz w:val="30"/>
                 <w:szCs w:val="30"/>
                 <w:rtl/>
                 <w:lang w:bidi="ar-SA"/>
               </w:rPr>
-              <w:t xml:space="preserve">أمامَكَ</w:t>
+              <w:t xml:space="preserve">أمامَ</w:t>
+            </w:r>
+            <w:r>
+              <w:rPr>
+                <w:rFonts w:ascii="Arakom" w:cs="Arakom" w:eastAsia="Arakom" w:hAnsi="Arakom"/>
+                <w:b/>
+                <w:bCs/>
+                <w:color w:val="1F4E79"/>
+                <w:sz w:val="30"/>
+                <w:szCs w:val="30"/>
+                <w:rtl/>
+                <w:lang w:bidi="ar-SA"/>
+              </w:rPr>
+              <w:t xml:space="preserve">كَ</w:t>
             </w:r>
           </w:p>
           <w:p>
@@ -2399,15 +2585,27 @@
             <w:r>
               <w:rPr>
                 <w:rFonts w:ascii="Arakom" w:cs="Arakom" w:eastAsia="Arakom" w:hAnsi="Arakom"/>
-                <w:b/>
-                <w:bCs/>
+                <w:b w:val="false"/>
                 <w:color w:val="000000"/>
                 <w:sz w:val="30"/>
                 <w:szCs w:val="30"/>
                 <w:rtl/>
                 <w:lang w:bidi="ar-SA"/>
               </w:rPr>
-              <w:t xml:space="preserve">صَديقَتِها</w:t>
+              <w:t xml:space="preserve">صَديقَتِ</w:t>
+            </w:r>
+            <w:r>
+              <w:rPr>
+                <w:rFonts w:ascii="Arakom" w:cs="Arakom" w:eastAsia="Arakom" w:hAnsi="Arakom"/>
+                <w:b/>
+                <w:bCs/>
+                <w:color w:val="1F4E79"/>
+                <w:sz w:val="30"/>
+                <w:szCs w:val="30"/>
+                <w:rtl/>
+                <w:lang w:bidi="ar-SA"/>
+              </w:rPr>
+              <w:t xml:space="preserve">ها</w:t>
             </w:r>
           </w:p>
           <w:p>
@@ -2794,7 +2992,7 @@
                 <w:sz w:val="16"/>
                 <w:szCs w:val="16"/>
               </w:rPr>
-              <w:t xml:space="preserve">soldaki fiil üç harfli, sağdaki dört harfli</w:t>
+              <w:t xml:space="preserve">sağdaki fiil üç harfli, soldaki dört harfli</w:t>
             </w:r>
           </w:p>
         </w:tc>
@@ -2821,7 +3019,7 @@
     </w:p>
     <w:tbl>
       <w:tblPr>
-        <w:bidiVisual w:val="false"/>
+        <w:bidiVisual/>
         <w:tblW w:type="dxa" w:w="10546"/>
         <w:tblBorders>
           <w:top w:val="none" w:color="FFFFFF" w:sz="0"/>
@@ -3416,7 +3614,20 @@
                 <w:rtl/>
                 <w:lang w:bidi="ar-SA"/>
               </w:rPr>
-              <w:t xml:space="preserve">ذَهَبْتُ</w:t>
+              <w:t xml:space="preserve">ذَهَب</w:t>
+            </w:r>
+            <w:r>
+              <w:rPr>
+                <w:rFonts w:ascii="Arakom" w:cs="Arakom" w:eastAsia="Arakom" w:hAnsi="Arakom"/>
+                <w:b/>
+                <w:bCs/>
+                <w:color w:val="1F4E79"/>
+                <w:sz w:val="30"/>
+                <w:szCs w:val="30"/>
+                <w:rtl/>
+                <w:lang w:bidi="ar-SA"/>
+              </w:rPr>
+              <w:t xml:space="preserve">ْتُ</w:t>
             </w:r>
           </w:p>
         </w:tc>
@@ -3448,14 +3659,27 @@
             <w:r>
               <w:rPr>
                 <w:rFonts w:ascii="Arakom" w:cs="Arakom" w:eastAsia="Arakom" w:hAnsi="Arakom"/>
-                <w:b w:val="false"/>
-                <w:color w:val="000000"/>
+                <w:b/>
+                <w:bCs/>
+                <w:color w:val="1F4E79"/>
                 <w:sz w:val="30"/>
                 <w:szCs w:val="30"/>
                 <w:rtl/>
                 <w:lang w:bidi="ar-SA"/>
               </w:rPr>
-              <w:t xml:space="preserve">أَذْهَبُ</w:t>
+              <w:t xml:space="preserve">أَ</w:t>
+            </w:r>
+            <w:r>
+              <w:rPr>
+                <w:rFonts w:ascii="Arakom" w:cs="Arakom" w:eastAsia="Arakom" w:hAnsi="Arakom"/>
+                <w:b w:val="false"/>
+                <w:color w:val="000000"/>
+                <w:sz w:val="30"/>
+                <w:szCs w:val="30"/>
+                <w:rtl/>
+                <w:lang w:bidi="ar-SA"/>
+              </w:rPr>
+              <w:t xml:space="preserve">ذْهَبُ</w:t>
             </w:r>
           </w:p>
         </w:tc>
@@ -3494,7 +3718,20 @@
                 <w:rtl/>
                 <w:lang w:bidi="ar-SA"/>
               </w:rPr>
-              <w:t xml:space="preserve">سَافَرْتُ</w:t>
+              <w:t xml:space="preserve">سَافَر</w:t>
+            </w:r>
+            <w:r>
+              <w:rPr>
+                <w:rFonts w:ascii="Arakom" w:cs="Arakom" w:eastAsia="Arakom" w:hAnsi="Arakom"/>
+                <w:b/>
+                <w:bCs/>
+                <w:color w:val="1F4E79"/>
+                <w:sz w:val="30"/>
+                <w:szCs w:val="30"/>
+                <w:rtl/>
+                <w:lang w:bidi="ar-SA"/>
+              </w:rPr>
+              <w:t xml:space="preserve">ْتُ</w:t>
             </w:r>
           </w:p>
         </w:tc>
@@ -3526,14 +3763,27 @@
             <w:r>
               <w:rPr>
                 <w:rFonts w:ascii="Arakom" w:cs="Arakom" w:eastAsia="Arakom" w:hAnsi="Arakom"/>
-                <w:b w:val="false"/>
-                <w:color w:val="000000"/>
+                <w:b/>
+                <w:bCs/>
+                <w:color w:val="1F4E79"/>
                 <w:sz w:val="30"/>
                 <w:szCs w:val="30"/>
                 <w:rtl/>
                 <w:lang w:bidi="ar-SA"/>
               </w:rPr>
-              <w:t xml:space="preserve">أُسَافِرُ</w:t>
+              <w:t xml:space="preserve">أُ</w:t>
+            </w:r>
+            <w:r>
+              <w:rPr>
+                <w:rFonts w:ascii="Arakom" w:cs="Arakom" w:eastAsia="Arakom" w:hAnsi="Arakom"/>
+                <w:b w:val="false"/>
+                <w:color w:val="000000"/>
+                <w:sz w:val="30"/>
+                <w:szCs w:val="30"/>
+                <w:rtl/>
+                <w:lang w:bidi="ar-SA"/>
+              </w:rPr>
+              <w:t xml:space="preserve">سَافِرُ</w:t>
             </w:r>
           </w:p>
         </w:tc>
@@ -3657,7 +3907,20 @@
                 <w:rtl/>
                 <w:lang w:bidi="ar-SA"/>
               </w:rPr>
-              <w:t xml:space="preserve">ذَهَبْنَا</w:t>
+              <w:t xml:space="preserve">ذَهَب</w:t>
+            </w:r>
+            <w:r>
+              <w:rPr>
+                <w:rFonts w:ascii="Arakom" w:cs="Arakom" w:eastAsia="Arakom" w:hAnsi="Arakom"/>
+                <w:b/>
+                <w:bCs/>
+                <w:color w:val="1F4E79"/>
+                <w:sz w:val="30"/>
+                <w:szCs w:val="30"/>
+                <w:rtl/>
+                <w:lang w:bidi="ar-SA"/>
+              </w:rPr>
+              <w:t xml:space="preserve">ْنَا</w:t>
             </w:r>
           </w:p>
         </w:tc>
@@ -3689,14 +3952,27 @@
             <w:r>
               <w:rPr>
                 <w:rFonts w:ascii="Arakom" w:cs="Arakom" w:eastAsia="Arakom" w:hAnsi="Arakom"/>
-                <w:b w:val="false"/>
-                <w:color w:val="000000"/>
+                <w:b/>
+                <w:bCs/>
+                <w:color w:val="1F4E79"/>
                 <w:sz w:val="30"/>
                 <w:szCs w:val="30"/>
                 <w:rtl/>
                 <w:lang w:bidi="ar-SA"/>
               </w:rPr>
-              <w:t xml:space="preserve">نَذْهَبُ</w:t>
+              <w:t xml:space="preserve">نَ</w:t>
+            </w:r>
+            <w:r>
+              <w:rPr>
+                <w:rFonts w:ascii="Arakom" w:cs="Arakom" w:eastAsia="Arakom" w:hAnsi="Arakom"/>
+                <w:b w:val="false"/>
+                <w:color w:val="000000"/>
+                <w:sz w:val="30"/>
+                <w:szCs w:val="30"/>
+                <w:rtl/>
+                <w:lang w:bidi="ar-SA"/>
+              </w:rPr>
+              <w:t xml:space="preserve">ذْهَبُ</w:t>
             </w:r>
           </w:p>
         </w:tc>
@@ -3735,7 +4011,20 @@
                 <w:rtl/>
                 <w:lang w:bidi="ar-SA"/>
               </w:rPr>
-              <w:t xml:space="preserve">سَافَرْنَا</w:t>
+              <w:t xml:space="preserve">سَافَر</w:t>
+            </w:r>
+            <w:r>
+              <w:rPr>
+                <w:rFonts w:ascii="Arakom" w:cs="Arakom" w:eastAsia="Arakom" w:hAnsi="Arakom"/>
+                <w:b/>
+                <w:bCs/>
+                <w:color w:val="1F4E79"/>
+                <w:sz w:val="30"/>
+                <w:szCs w:val="30"/>
+                <w:rtl/>
+                <w:lang w:bidi="ar-SA"/>
+              </w:rPr>
+              <w:t xml:space="preserve">ْنَا</w:t>
             </w:r>
           </w:p>
         </w:tc>
@@ -3767,14 +4056,27 @@
             <w:r>
               <w:rPr>
                 <w:rFonts w:ascii="Arakom" w:cs="Arakom" w:eastAsia="Arakom" w:hAnsi="Arakom"/>
-                <w:b w:val="false"/>
-                <w:color w:val="000000"/>
+                <w:b/>
+                <w:bCs/>
+                <w:color w:val="1F4E79"/>
                 <w:sz w:val="30"/>
                 <w:szCs w:val="30"/>
                 <w:rtl/>
                 <w:lang w:bidi="ar-SA"/>
               </w:rPr>
-              <w:t xml:space="preserve">نُسَافِرُ</w:t>
+              <w:t xml:space="preserve">نُ</w:t>
+            </w:r>
+            <w:r>
+              <w:rPr>
+                <w:rFonts w:ascii="Arakom" w:cs="Arakom" w:eastAsia="Arakom" w:hAnsi="Arakom"/>
+                <w:b w:val="false"/>
+                <w:color w:val="000000"/>
+                <w:sz w:val="30"/>
+                <w:szCs w:val="30"/>
+                <w:rtl/>
+                <w:lang w:bidi="ar-SA"/>
+              </w:rPr>
+              <w:t xml:space="preserve">سَافِرُ</w:t>
             </w:r>
           </w:p>
         </w:tc>
@@ -3898,7 +4200,20 @@
                 <w:rtl/>
                 <w:lang w:bidi="ar-SA"/>
               </w:rPr>
-              <w:t xml:space="preserve">ذَهَبْتَ</w:t>
+              <w:t xml:space="preserve">ذَهَب</w:t>
+            </w:r>
+            <w:r>
+              <w:rPr>
+                <w:rFonts w:ascii="Arakom" w:cs="Arakom" w:eastAsia="Arakom" w:hAnsi="Arakom"/>
+                <w:b/>
+                <w:bCs/>
+                <w:color w:val="1F4E79"/>
+                <w:sz w:val="30"/>
+                <w:szCs w:val="30"/>
+                <w:rtl/>
+                <w:lang w:bidi="ar-SA"/>
+              </w:rPr>
+              <w:t xml:space="preserve">ْتَ</w:t>
             </w:r>
           </w:p>
         </w:tc>
@@ -3930,14 +4245,27 @@
             <w:r>
               <w:rPr>
                 <w:rFonts w:ascii="Arakom" w:cs="Arakom" w:eastAsia="Arakom" w:hAnsi="Arakom"/>
-                <w:b w:val="false"/>
-                <w:color w:val="000000"/>
+                <w:b/>
+                <w:bCs/>
+                <w:color w:val="1F4E79"/>
                 <w:sz w:val="30"/>
                 <w:szCs w:val="30"/>
                 <w:rtl/>
                 <w:lang w:bidi="ar-SA"/>
               </w:rPr>
-              <w:t xml:space="preserve">تَذْهَبُ</w:t>
+              <w:t xml:space="preserve">تَ</w:t>
+            </w:r>
+            <w:r>
+              <w:rPr>
+                <w:rFonts w:ascii="Arakom" w:cs="Arakom" w:eastAsia="Arakom" w:hAnsi="Arakom"/>
+                <w:b w:val="false"/>
+                <w:color w:val="000000"/>
+                <w:sz w:val="30"/>
+                <w:szCs w:val="30"/>
+                <w:rtl/>
+                <w:lang w:bidi="ar-SA"/>
+              </w:rPr>
+              <w:t xml:space="preserve">ذْهَبُ</w:t>
             </w:r>
           </w:p>
         </w:tc>
@@ -3976,7 +4304,20 @@
                 <w:rtl/>
                 <w:lang w:bidi="ar-SA"/>
               </w:rPr>
-              <w:t xml:space="preserve">سَافَرْتَ</w:t>
+              <w:t xml:space="preserve">سَافَر</w:t>
+            </w:r>
+            <w:r>
+              <w:rPr>
+                <w:rFonts w:ascii="Arakom" w:cs="Arakom" w:eastAsia="Arakom" w:hAnsi="Arakom"/>
+                <w:b/>
+                <w:bCs/>
+                <w:color w:val="1F4E79"/>
+                <w:sz w:val="30"/>
+                <w:szCs w:val="30"/>
+                <w:rtl/>
+                <w:lang w:bidi="ar-SA"/>
+              </w:rPr>
+              <w:t xml:space="preserve">ْتَ</w:t>
             </w:r>
           </w:p>
         </w:tc>
@@ -4008,14 +4349,27 @@
             <w:r>
               <w:rPr>
                 <w:rFonts w:ascii="Arakom" w:cs="Arakom" w:eastAsia="Arakom" w:hAnsi="Arakom"/>
-                <w:b w:val="false"/>
-                <w:color w:val="000000"/>
+                <w:b/>
+                <w:bCs/>
+                <w:color w:val="1F4E79"/>
                 <w:sz w:val="30"/>
                 <w:szCs w:val="30"/>
                 <w:rtl/>
                 <w:lang w:bidi="ar-SA"/>
               </w:rPr>
-              <w:t xml:space="preserve">تُسَافِرُ</w:t>
+              <w:t xml:space="preserve">تُ</w:t>
+            </w:r>
+            <w:r>
+              <w:rPr>
+                <w:rFonts w:ascii="Arakom" w:cs="Arakom" w:eastAsia="Arakom" w:hAnsi="Arakom"/>
+                <w:b w:val="false"/>
+                <w:color w:val="000000"/>
+                <w:sz w:val="30"/>
+                <w:szCs w:val="30"/>
+                <w:rtl/>
+                <w:lang w:bidi="ar-SA"/>
+              </w:rPr>
+              <w:t xml:space="preserve">سَافِرُ</w:t>
             </w:r>
           </w:p>
         </w:tc>
@@ -4139,7 +4493,20 @@
                 <w:rtl/>
                 <w:lang w:bidi="ar-SA"/>
               </w:rPr>
-              <w:t xml:space="preserve">ذَهَبْتِ</w:t>
+              <w:t xml:space="preserve">ذَهَب</w:t>
+            </w:r>
+            <w:r>
+              <w:rPr>
+                <w:rFonts w:ascii="Arakom" w:cs="Arakom" w:eastAsia="Arakom" w:hAnsi="Arakom"/>
+                <w:b/>
+                <w:bCs/>
+                <w:color w:val="1F4E79"/>
+                <w:sz w:val="30"/>
+                <w:szCs w:val="30"/>
+                <w:rtl/>
+                <w:lang w:bidi="ar-SA"/>
+              </w:rPr>
+              <w:t xml:space="preserve">ْتِ</w:t>
             </w:r>
           </w:p>
         </w:tc>
@@ -4171,14 +4538,40 @@
             <w:r>
               <w:rPr>
                 <w:rFonts w:ascii="Arakom" w:cs="Arakom" w:eastAsia="Arakom" w:hAnsi="Arakom"/>
-                <w:b w:val="false"/>
-                <w:color w:val="000000"/>
+                <w:b/>
+                <w:bCs/>
+                <w:color w:val="1F4E79"/>
                 <w:sz w:val="30"/>
                 <w:szCs w:val="30"/>
                 <w:rtl/>
                 <w:lang w:bidi="ar-SA"/>
               </w:rPr>
-              <w:t xml:space="preserve">تَذْهَبِينَ</w:t>
+              <w:t xml:space="preserve">تَ</w:t>
+            </w:r>
+            <w:r>
+              <w:rPr>
+                <w:rFonts w:ascii="Arakom" w:cs="Arakom" w:eastAsia="Arakom" w:hAnsi="Arakom"/>
+                <w:b w:val="false"/>
+                <w:color w:val="000000"/>
+                <w:sz w:val="30"/>
+                <w:szCs w:val="30"/>
+                <w:rtl/>
+                <w:lang w:bidi="ar-SA"/>
+              </w:rPr>
+              <w:t xml:space="preserve">ذْهَبِ</w:t>
+            </w:r>
+            <w:r>
+              <w:rPr>
+                <w:rFonts w:ascii="Arakom" w:cs="Arakom" w:eastAsia="Arakom" w:hAnsi="Arakom"/>
+                <w:b/>
+                <w:bCs/>
+                <w:color w:val="1F4E79"/>
+                <w:sz w:val="30"/>
+                <w:szCs w:val="30"/>
+                <w:rtl/>
+                <w:lang w:bidi="ar-SA"/>
+              </w:rPr>
+              <w:t xml:space="preserve">ينَ</w:t>
             </w:r>
           </w:p>
         </w:tc>
@@ -4217,7 +4610,20 @@
                 <w:rtl/>
                 <w:lang w:bidi="ar-SA"/>
               </w:rPr>
-              <w:t xml:space="preserve">سَافَرْتِ</w:t>
+              <w:t xml:space="preserve">سَافَر</w:t>
+            </w:r>
+            <w:r>
+              <w:rPr>
+                <w:rFonts w:ascii="Arakom" w:cs="Arakom" w:eastAsia="Arakom" w:hAnsi="Arakom"/>
+                <w:b/>
+                <w:bCs/>
+                <w:color w:val="1F4E79"/>
+                <w:sz w:val="30"/>
+                <w:szCs w:val="30"/>
+                <w:rtl/>
+                <w:lang w:bidi="ar-SA"/>
+              </w:rPr>
+              <w:t xml:space="preserve">ْتِ</w:t>
             </w:r>
           </w:p>
         </w:tc>
@@ -4249,14 +4655,40 @@
             <w:r>
               <w:rPr>
                 <w:rFonts w:ascii="Arakom" w:cs="Arakom" w:eastAsia="Arakom" w:hAnsi="Arakom"/>
-                <w:b w:val="false"/>
-                <w:color w:val="000000"/>
+                <w:b/>
+                <w:bCs/>
+                <w:color w:val="1F4E79"/>
                 <w:sz w:val="30"/>
                 <w:szCs w:val="30"/>
                 <w:rtl/>
                 <w:lang w:bidi="ar-SA"/>
               </w:rPr>
-              <w:t xml:space="preserve">تُسَافِرِينَ</w:t>
+              <w:t xml:space="preserve">تُ</w:t>
+            </w:r>
+            <w:r>
+              <w:rPr>
+                <w:rFonts w:ascii="Arakom" w:cs="Arakom" w:eastAsia="Arakom" w:hAnsi="Arakom"/>
+                <w:b w:val="false"/>
+                <w:color w:val="000000"/>
+                <w:sz w:val="30"/>
+                <w:szCs w:val="30"/>
+                <w:rtl/>
+                <w:lang w:bidi="ar-SA"/>
+              </w:rPr>
+              <w:t xml:space="preserve">سَافِرِ</w:t>
+            </w:r>
+            <w:r>
+              <w:rPr>
+                <w:rFonts w:ascii="Arakom" w:cs="Arakom" w:eastAsia="Arakom" w:hAnsi="Arakom"/>
+                <w:b/>
+                <w:bCs/>
+                <w:color w:val="1F4E79"/>
+                <w:sz w:val="30"/>
+                <w:szCs w:val="30"/>
+                <w:rtl/>
+                <w:lang w:bidi="ar-SA"/>
+              </w:rPr>
+              <w:t xml:space="preserve">ينَ</w:t>
             </w:r>
           </w:p>
         </w:tc>
@@ -4380,7 +4812,20 @@
                 <w:rtl/>
                 <w:lang w:bidi="ar-SA"/>
               </w:rPr>
-              <w:t xml:space="preserve">ذَهَبَ</w:t>
+              <w:t xml:space="preserve">ذَهَب</w:t>
+            </w:r>
+            <w:r>
+              <w:rPr>
+                <w:rFonts w:ascii="Arakom" w:cs="Arakom" w:eastAsia="Arakom" w:hAnsi="Arakom"/>
+                <w:b/>
+                <w:bCs/>
+                <w:color w:val="1F4E79"/>
+                <w:sz w:val="30"/>
+                <w:szCs w:val="30"/>
+                <w:rtl/>
+                <w:lang w:bidi="ar-SA"/>
+              </w:rPr>
+              <w:t xml:space="preserve">َ</w:t>
             </w:r>
           </w:p>
         </w:tc>
@@ -4412,14 +4857,27 @@
             <w:r>
               <w:rPr>
                 <w:rFonts w:ascii="Arakom" w:cs="Arakom" w:eastAsia="Arakom" w:hAnsi="Arakom"/>
-                <w:b w:val="false"/>
-                <w:color w:val="000000"/>
+                <w:b/>
+                <w:bCs/>
+                <w:color w:val="1F4E79"/>
                 <w:sz w:val="30"/>
                 <w:szCs w:val="30"/>
                 <w:rtl/>
                 <w:lang w:bidi="ar-SA"/>
               </w:rPr>
-              <w:t xml:space="preserve">يَذْهَبُ</w:t>
+              <w:t xml:space="preserve">يَ</w:t>
+            </w:r>
+            <w:r>
+              <w:rPr>
+                <w:rFonts w:ascii="Arakom" w:cs="Arakom" w:eastAsia="Arakom" w:hAnsi="Arakom"/>
+                <w:b w:val="false"/>
+                <w:color w:val="000000"/>
+                <w:sz w:val="30"/>
+                <w:szCs w:val="30"/>
+                <w:rtl/>
+                <w:lang w:bidi="ar-SA"/>
+              </w:rPr>
+              <w:t xml:space="preserve">ذْهَبُ</w:t>
             </w:r>
           </w:p>
         </w:tc>
@@ -4458,7 +4916,20 @@
                 <w:rtl/>
                 <w:lang w:bidi="ar-SA"/>
               </w:rPr>
-              <w:t xml:space="preserve">سَافَرَ</w:t>
+              <w:t xml:space="preserve">سَافَر</w:t>
+            </w:r>
+            <w:r>
+              <w:rPr>
+                <w:rFonts w:ascii="Arakom" w:cs="Arakom" w:eastAsia="Arakom" w:hAnsi="Arakom"/>
+                <w:b/>
+                <w:bCs/>
+                <w:color w:val="1F4E79"/>
+                <w:sz w:val="30"/>
+                <w:szCs w:val="30"/>
+                <w:rtl/>
+                <w:lang w:bidi="ar-SA"/>
+              </w:rPr>
+              <w:t xml:space="preserve">َ</w:t>
             </w:r>
           </w:p>
         </w:tc>
@@ -4490,14 +4961,27 @@
             <w:r>
               <w:rPr>
                 <w:rFonts w:ascii="Arakom" w:cs="Arakom" w:eastAsia="Arakom" w:hAnsi="Arakom"/>
-                <w:b w:val="false"/>
-                <w:color w:val="000000"/>
+                <w:b/>
+                <w:bCs/>
+                <w:color w:val="1F4E79"/>
                 <w:sz w:val="30"/>
                 <w:szCs w:val="30"/>
                 <w:rtl/>
                 <w:lang w:bidi="ar-SA"/>
               </w:rPr>
-              <w:t xml:space="preserve">يُسَافِرُ</w:t>
+              <w:t xml:space="preserve">يُ</w:t>
+            </w:r>
+            <w:r>
+              <w:rPr>
+                <w:rFonts w:ascii="Arakom" w:cs="Arakom" w:eastAsia="Arakom" w:hAnsi="Arakom"/>
+                <w:b w:val="false"/>
+                <w:color w:val="000000"/>
+                <w:sz w:val="30"/>
+                <w:szCs w:val="30"/>
+                <w:rtl/>
+                <w:lang w:bidi="ar-SA"/>
+              </w:rPr>
+              <w:t xml:space="preserve">سَافِرُ</w:t>
             </w:r>
           </w:p>
         </w:tc>
@@ -4621,7 +5105,20 @@
                 <w:rtl/>
                 <w:lang w:bidi="ar-SA"/>
               </w:rPr>
-              <w:t xml:space="preserve">ذَهَبَتْ</w:t>
+              <w:t xml:space="preserve">ذَهَبَ</w:t>
+            </w:r>
+            <w:r>
+              <w:rPr>
+                <w:rFonts w:ascii="Arakom" w:cs="Arakom" w:eastAsia="Arakom" w:hAnsi="Arakom"/>
+                <w:b/>
+                <w:bCs/>
+                <w:color w:val="1F4E79"/>
+                <w:sz w:val="30"/>
+                <w:szCs w:val="30"/>
+                <w:rtl/>
+                <w:lang w:bidi="ar-SA"/>
+              </w:rPr>
+              <w:t xml:space="preserve">تْ</w:t>
             </w:r>
           </w:p>
         </w:tc>
@@ -4653,14 +5150,27 @@
             <w:r>
               <w:rPr>
                 <w:rFonts w:ascii="Arakom" w:cs="Arakom" w:eastAsia="Arakom" w:hAnsi="Arakom"/>
-                <w:b w:val="false"/>
-                <w:color w:val="000000"/>
+                <w:b/>
+                <w:bCs/>
+                <w:color w:val="1F4E79"/>
                 <w:sz w:val="30"/>
                 <w:szCs w:val="30"/>
                 <w:rtl/>
                 <w:lang w:bidi="ar-SA"/>
               </w:rPr>
-              <w:t xml:space="preserve">تَذْهَبُ</w:t>
+              <w:t xml:space="preserve">تَ</w:t>
+            </w:r>
+            <w:r>
+              <w:rPr>
+                <w:rFonts w:ascii="Arakom" w:cs="Arakom" w:eastAsia="Arakom" w:hAnsi="Arakom"/>
+                <w:b w:val="false"/>
+                <w:color w:val="000000"/>
+                <w:sz w:val="30"/>
+                <w:szCs w:val="30"/>
+                <w:rtl/>
+                <w:lang w:bidi="ar-SA"/>
+              </w:rPr>
+              <w:t xml:space="preserve">ذْهَبُ</w:t>
             </w:r>
           </w:p>
         </w:tc>
@@ -4699,7 +5209,20 @@
                 <w:rtl/>
                 <w:lang w:bidi="ar-SA"/>
               </w:rPr>
-              <w:t xml:space="preserve">سَافَرَتْ</w:t>
+              <w:t xml:space="preserve">سَافَرَ</w:t>
+            </w:r>
+            <w:r>
+              <w:rPr>
+                <w:rFonts w:ascii="Arakom" w:cs="Arakom" w:eastAsia="Arakom" w:hAnsi="Arakom"/>
+                <w:b/>
+                <w:bCs/>
+                <w:color w:val="1F4E79"/>
+                <w:sz w:val="30"/>
+                <w:szCs w:val="30"/>
+                <w:rtl/>
+                <w:lang w:bidi="ar-SA"/>
+              </w:rPr>
+              <w:t xml:space="preserve">تْ</w:t>
             </w:r>
           </w:p>
         </w:tc>
@@ -4731,14 +5254,27 @@
             <w:r>
               <w:rPr>
                 <w:rFonts w:ascii="Arakom" w:cs="Arakom" w:eastAsia="Arakom" w:hAnsi="Arakom"/>
-                <w:b w:val="false"/>
-                <w:color w:val="000000"/>
+                <w:b/>
+                <w:bCs/>
+                <w:color w:val="1F4E79"/>
                 <w:sz w:val="30"/>
                 <w:szCs w:val="30"/>
                 <w:rtl/>
                 <w:lang w:bidi="ar-SA"/>
               </w:rPr>
-              <w:t xml:space="preserve">تُسَافِرُ</w:t>
+              <w:t xml:space="preserve">تُ</w:t>
+            </w:r>
+            <w:r>
+              <w:rPr>
+                <w:rFonts w:ascii="Arakom" w:cs="Arakom" w:eastAsia="Arakom" w:hAnsi="Arakom"/>
+                <w:b w:val="false"/>
+                <w:color w:val="000000"/>
+                <w:sz w:val="30"/>
+                <w:szCs w:val="30"/>
+                <w:rtl/>
+                <w:lang w:bidi="ar-SA"/>
+              </w:rPr>
+              <w:t xml:space="preserve">سَافِرُ</w:t>
             </w:r>
           </w:p>
         </w:tc>
@@ -5794,7 +6330,7 @@
     </w:p>
     <w:tbl>
       <w:tblPr>
-        <w:bidiVisual w:val="false"/>
+        <w:bidiVisual/>
         <w:tblW w:type="dxa" w:w="10546"/>
         <w:tblBorders>
           <w:top w:val="none" w:color="FFFFFF" w:sz="0"/>
@@ -5841,14 +6377,27 @@
             <w:r>
               <w:rPr>
                 <w:rFonts w:ascii="Arakom" w:cs="Arakom" w:eastAsia="Arakom" w:hAnsi="Arakom"/>
-                <w:b w:val="false"/>
-                <w:color w:val="000000"/>
+                <w:b/>
+                <w:bCs/>
+                <w:color w:val="1F4E79"/>
                 <w:sz w:val="28"/>
                 <w:szCs w:val="28"/>
                 <w:rtl/>
                 <w:lang w:bidi="ar-SA"/>
               </w:rPr>
-              <w:t xml:space="preserve">أَذْهَبُ إِلى المَدْرَسَة.</w:t>
+              <w:t xml:space="preserve">أَذْهَبُ</w:t>
+            </w:r>
+            <w:r>
+              <w:rPr>
+                <w:rFonts w:ascii="Arakom" w:cs="Arakom" w:eastAsia="Arakom" w:hAnsi="Arakom"/>
+                <w:b w:val="false"/>
+                <w:color w:val="000000"/>
+                <w:sz w:val="28"/>
+                <w:szCs w:val="28"/>
+                <w:rtl/>
+                <w:lang w:bidi="ar-SA"/>
+              </w:rPr>
+              <w:t xml:space="preserve"> إِلى المَدْرَسَة.</w:t>
             </w:r>
           </w:p>
           <w:p>
@@ -5900,14 +6449,27 @@
             <w:r>
               <w:rPr>
                 <w:rFonts w:ascii="Arakom" w:cs="Arakom" w:eastAsia="Arakom" w:hAnsi="Arakom"/>
-                <w:b w:val="false"/>
-                <w:color w:val="000000"/>
+                <w:b/>
+                <w:bCs/>
+                <w:color w:val="1F4E79"/>
                 <w:sz w:val="28"/>
                 <w:szCs w:val="28"/>
                 <w:rtl/>
                 <w:lang w:bidi="ar-SA"/>
               </w:rPr>
-              <w:t xml:space="preserve">سافَرْتُ إلى إِسْطَنْبول قَبْلَ يَوْمَيْن.</w:t>
+              <w:t xml:space="preserve">سافَرْتُ</w:t>
+            </w:r>
+            <w:r>
+              <w:rPr>
+                <w:rFonts w:ascii="Arakom" w:cs="Arakom" w:eastAsia="Arakom" w:hAnsi="Arakom"/>
+                <w:b w:val="false"/>
+                <w:color w:val="000000"/>
+                <w:sz w:val="28"/>
+                <w:szCs w:val="28"/>
+                <w:rtl/>
+                <w:lang w:bidi="ar-SA"/>
+              </w:rPr>
+              <w:t xml:space="preserve"> إلى إِسْطَنْبول قَبْلَ يَوْمَيْن.</w:t>
             </w:r>
           </w:p>
           <w:p>
@@ -6099,7 +6661,7 @@
     </w:p>
     <w:tbl>
       <w:tblPr>
-        <w:bidiVisual w:val="false"/>
+        <w:bidiVisual/>
         <w:tblW w:type="dxa" w:w="10546"/>
         <w:tblBorders>
           <w:top w:val="none" w:color="FFFFFF" w:sz="0"/>
@@ -6352,14 +6914,27 @@
             <w:r>
               <w:rPr>
                 <w:rFonts w:ascii="Arakom" w:cs="Arakom" w:eastAsia="Arakom" w:hAnsi="Arakom"/>
-                <w:b w:val="false"/>
-                <w:color w:val="000000"/>
+                <w:b/>
+                <w:bCs/>
+                <w:color w:val="1F4E79"/>
                 <w:sz w:val="26"/>
                 <w:szCs w:val="26"/>
                 <w:rtl/>
                 <w:lang w:bidi="ar-SA"/>
               </w:rPr>
-              <w:t xml:space="preserve">مَنْ يَخْتارُ نادي النَّظافَة؟</w:t>
+              <w:t xml:space="preserve">مَنْ</w:t>
+            </w:r>
+            <w:r>
+              <w:rPr>
+                <w:rFonts w:ascii="Arakom" w:cs="Arakom" w:eastAsia="Arakom" w:hAnsi="Arakom"/>
+                <w:b w:val="false"/>
+                <w:color w:val="000000"/>
+                <w:sz w:val="26"/>
+                <w:szCs w:val="26"/>
+                <w:rtl/>
+                <w:lang w:bidi="ar-SA"/>
+              </w:rPr>
+              <w:t xml:space="preserve"> يَخْتارُ نادي النَّظافَة؟</w:t>
             </w:r>
           </w:p>
           <w:p>
@@ -6503,7 +7078,32 @@
                 <w:rtl/>
                 <w:lang w:bidi="ar-SA"/>
               </w:rPr>
-              <w:t xml:space="preserve">مَرْحَبًا، ما هي الأماكِن لِلزِّيارَة هُنا؟</w:t>
+              <w:t xml:space="preserve">مَرْحَبًا، </w:t>
+            </w:r>
+            <w:r>
+              <w:rPr>
+                <w:rFonts w:ascii="Arakom" w:cs="Arakom" w:eastAsia="Arakom" w:hAnsi="Arakom"/>
+                <w:b/>
+                <w:bCs/>
+                <w:color w:val="1F4E79"/>
+                <w:sz w:val="26"/>
+                <w:szCs w:val="26"/>
+                <w:rtl/>
+                <w:lang w:bidi="ar-SA"/>
+              </w:rPr>
+              <w:t xml:space="preserve">ما</w:t>
+            </w:r>
+            <w:r>
+              <w:rPr>
+                <w:rFonts w:ascii="Arakom" w:cs="Arakom" w:eastAsia="Arakom" w:hAnsi="Arakom"/>
+                <w:b w:val="false"/>
+                <w:color w:val="000000"/>
+                <w:sz w:val="26"/>
+                <w:szCs w:val="26"/>
+                <w:rtl/>
+                <w:lang w:bidi="ar-SA"/>
+              </w:rPr>
+              <w:t xml:space="preserve"> هي الأماكِن لِلزِّيارَة هُنا؟</w:t>
             </w:r>
           </w:p>
           <w:p>
@@ -6647,7 +7247,32 @@
                 <w:rtl/>
                 <w:lang w:bidi="ar-SA"/>
               </w:rPr>
-              <w:t xml:space="preserve">إلى ماذا تَحْتاجُ؟</w:t>
+              <w:t xml:space="preserve">إلى </w:t>
+            </w:r>
+            <w:r>
+              <w:rPr>
+                <w:rFonts w:ascii="Arakom" w:cs="Arakom" w:eastAsia="Arakom" w:hAnsi="Arakom"/>
+                <w:b/>
+                <w:bCs/>
+                <w:color w:val="1F4E79"/>
+                <w:sz w:val="26"/>
+                <w:szCs w:val="26"/>
+                <w:rtl/>
+                <w:lang w:bidi="ar-SA"/>
+              </w:rPr>
+              <w:t xml:space="preserve">ماذا</w:t>
+            </w:r>
+            <w:r>
+              <w:rPr>
+                <w:rFonts w:ascii="Arakom" w:cs="Arakom" w:eastAsia="Arakom" w:hAnsi="Arakom"/>
+                <w:b w:val="false"/>
+                <w:color w:val="000000"/>
+                <w:sz w:val="26"/>
+                <w:szCs w:val="26"/>
+                <w:rtl/>
+                <w:lang w:bidi="ar-SA"/>
+              </w:rPr>
+              <w:t xml:space="preserve"> تَحْتاجُ؟</w:t>
             </w:r>
           </w:p>
           <w:p>
@@ -6784,14 +7409,27 @@
             <w:r>
               <w:rPr>
                 <w:rFonts w:ascii="Arakom" w:cs="Arakom" w:eastAsia="Arakom" w:hAnsi="Arakom"/>
-                <w:b w:val="false"/>
-                <w:color w:val="000000"/>
+                <w:b/>
+                <w:bCs/>
+                <w:color w:val="1F4E79"/>
                 <w:sz w:val="26"/>
                 <w:szCs w:val="26"/>
                 <w:rtl/>
                 <w:lang w:bidi="ar-SA"/>
               </w:rPr>
-              <w:t xml:space="preserve">مَتى سَنَخْتارُ الأَنْدِيَة؟</w:t>
+              <w:t xml:space="preserve">مَتى</w:t>
+            </w:r>
+            <w:r>
+              <w:rPr>
+                <w:rFonts w:ascii="Arakom" w:cs="Arakom" w:eastAsia="Arakom" w:hAnsi="Arakom"/>
+                <w:b w:val="false"/>
+                <w:color w:val="000000"/>
+                <w:sz w:val="26"/>
+                <w:szCs w:val="26"/>
+                <w:rtl/>
+                <w:lang w:bidi="ar-SA"/>
+              </w:rPr>
+              <w:t xml:space="preserve"> سَنَخْتارُ الأَنْدِيَة؟</w:t>
             </w:r>
           </w:p>
           <w:p>
@@ -6928,14 +7566,27 @@
             <w:r>
               <w:rPr>
                 <w:rFonts w:ascii="Arakom" w:cs="Arakom" w:eastAsia="Arakom" w:hAnsi="Arakom"/>
-                <w:b w:val="false"/>
-                <w:color w:val="000000"/>
+                <w:b/>
+                <w:bCs/>
+                <w:color w:val="1F4E79"/>
                 <w:sz w:val="26"/>
                 <w:szCs w:val="26"/>
                 <w:rtl/>
                 <w:lang w:bidi="ar-SA"/>
               </w:rPr>
-              <w:t xml:space="preserve">أَيْنَ تَقَعُ هذه المَدينَة في تُرْكِيا؟</w:t>
+              <w:t xml:space="preserve">أَيْنَ</w:t>
+            </w:r>
+            <w:r>
+              <w:rPr>
+                <w:rFonts w:ascii="Arakom" w:cs="Arakom" w:eastAsia="Arakom" w:hAnsi="Arakom"/>
+                <w:b w:val="false"/>
+                <w:color w:val="000000"/>
+                <w:sz w:val="26"/>
+                <w:szCs w:val="26"/>
+                <w:rtl/>
+                <w:lang w:bidi="ar-SA"/>
+              </w:rPr>
+              <w:t xml:space="preserve"> تَقَعُ هذه المَدينَة في تُرْكِيا؟</w:t>
             </w:r>
           </w:p>
           <w:p>
@@ -7079,7 +7730,32 @@
                 <w:rtl/>
                 <w:lang w:bidi="ar-SA"/>
               </w:rPr>
-              <w:t xml:space="preserve">مَرْحَبًا سُمَيَّة، إلى أَيْنَ أنتِ ذاهِبَة؟</w:t>
+              <w:t xml:space="preserve">مَرْحَبًا سُمَيَّة، </w:t>
+            </w:r>
+            <w:r>
+              <w:rPr>
+                <w:rFonts w:ascii="Arakom" w:cs="Arakom" w:eastAsia="Arakom" w:hAnsi="Arakom"/>
+                <w:b/>
+                <w:bCs/>
+                <w:color w:val="1F4E79"/>
+                <w:sz w:val="26"/>
+                <w:szCs w:val="26"/>
+                <w:rtl/>
+                <w:lang w:bidi="ar-SA"/>
+              </w:rPr>
+              <w:t xml:space="preserve">إلى أَيْنَ</w:t>
+            </w:r>
+            <w:r>
+              <w:rPr>
+                <w:rFonts w:ascii="Arakom" w:cs="Arakom" w:eastAsia="Arakom" w:hAnsi="Arakom"/>
+                <w:b w:val="false"/>
+                <w:color w:val="000000"/>
+                <w:sz w:val="26"/>
+                <w:szCs w:val="26"/>
+                <w:rtl/>
+                <w:lang w:bidi="ar-SA"/>
+              </w:rPr>
+              <w:t xml:space="preserve"> أنتِ ذاهِبَة؟</w:t>
             </w:r>
           </w:p>
           <w:p>
@@ -7216,14 +7892,27 @@
             <w:r>
               <w:rPr>
                 <w:rFonts w:ascii="Arakom" w:cs="Arakom" w:eastAsia="Arakom" w:hAnsi="Arakom"/>
-                <w:b w:val="false"/>
-                <w:color w:val="000000"/>
+                <w:b/>
+                <w:bCs/>
+                <w:color w:val="1F4E79"/>
                 <w:sz w:val="26"/>
                 <w:szCs w:val="26"/>
                 <w:rtl/>
                 <w:lang w:bidi="ar-SA"/>
               </w:rPr>
-              <w:t xml:space="preserve">كَيْفَ أَذْهَبُ إلى حَديقَة كُلْخانَة؟</w:t>
+              <w:t xml:space="preserve">كَيْفَ</w:t>
+            </w:r>
+            <w:r>
+              <w:rPr>
+                <w:rFonts w:ascii="Arakom" w:cs="Arakom" w:eastAsia="Arakom" w:hAnsi="Arakom"/>
+                <w:b w:val="false"/>
+                <w:color w:val="000000"/>
+                <w:sz w:val="26"/>
+                <w:szCs w:val="26"/>
+                <w:rtl/>
+                <w:lang w:bidi="ar-SA"/>
+              </w:rPr>
+              <w:t xml:space="preserve"> أَذْهَبُ إلى حَديقَة كُلْخانَة؟</w:t>
             </w:r>
           </w:p>
           <w:p>
@@ -7360,14 +8049,27 @@
             <w:r>
               <w:rPr>
                 <w:rFonts w:ascii="Arakom" w:cs="Arakom" w:eastAsia="Arakom" w:hAnsi="Arakom"/>
-                <w:b w:val="false"/>
-                <w:color w:val="000000"/>
+                <w:b/>
+                <w:bCs/>
+                <w:color w:val="1F4E79"/>
                 <w:sz w:val="26"/>
                 <w:szCs w:val="26"/>
                 <w:rtl/>
                 <w:lang w:bidi="ar-SA"/>
               </w:rPr>
-              <w:t xml:space="preserve">لِماذا تَخْتارُ نادي الرِّياضَة؟</w:t>
+              <w:t xml:space="preserve">لِماذا</w:t>
+            </w:r>
+            <w:r>
+              <w:rPr>
+                <w:rFonts w:ascii="Arakom" w:cs="Arakom" w:eastAsia="Arakom" w:hAnsi="Arakom"/>
+                <w:b w:val="false"/>
+                <w:color w:val="000000"/>
+                <w:sz w:val="26"/>
+                <w:szCs w:val="26"/>
+                <w:rtl/>
+                <w:lang w:bidi="ar-SA"/>
+              </w:rPr>
+              <w:t xml:space="preserve"> تَخْتارُ نادي الرِّياضَة؟</w:t>
             </w:r>
           </w:p>
           <w:p>
@@ -7504,14 +8206,27 @@
             <w:r>
               <w:rPr>
                 <w:rFonts w:ascii="Arakom" w:cs="Arakom" w:eastAsia="Arakom" w:hAnsi="Arakom"/>
-                <w:b w:val="false"/>
-                <w:color w:val="000000"/>
+                <w:b/>
+                <w:bCs/>
+                <w:color w:val="1F4E79"/>
                 <w:sz w:val="26"/>
                 <w:szCs w:val="26"/>
                 <w:rtl/>
                 <w:lang w:bidi="ar-SA"/>
               </w:rPr>
-              <w:t xml:space="preserve">هَلْ تُحِبُّ الرِّياضَة؟</w:t>
+              <w:t xml:space="preserve">هَلْ</w:t>
+            </w:r>
+            <w:r>
+              <w:rPr>
+                <w:rFonts w:ascii="Arakom" w:cs="Arakom" w:eastAsia="Arakom" w:hAnsi="Arakom"/>
+                <w:b w:val="false"/>
+                <w:color w:val="000000"/>
+                <w:sz w:val="26"/>
+                <w:szCs w:val="26"/>
+                <w:rtl/>
+                <w:lang w:bidi="ar-SA"/>
+              </w:rPr>
+              <w:t xml:space="preserve"> تُحِبُّ الرِّياضَة؟</w:t>
             </w:r>
           </w:p>
           <w:p>
@@ -7648,14 +8363,27 @@
             <w:r>
               <w:rPr>
                 <w:rFonts w:ascii="Arakom" w:cs="Arakom" w:eastAsia="Arakom" w:hAnsi="Arakom"/>
-                <w:b w:val="false"/>
-                <w:color w:val="000000"/>
+                <w:b/>
+                <w:bCs/>
+                <w:color w:val="1F4E79"/>
                 <w:sz w:val="26"/>
                 <w:szCs w:val="26"/>
                 <w:rtl/>
                 <w:lang w:bidi="ar-SA"/>
               </w:rPr>
-              <w:t xml:space="preserve">أَيَّ مَدينَة زارَ خالِد؟</w:t>
+              <w:t xml:space="preserve">أَيَّ</w:t>
+            </w:r>
+            <w:r>
+              <w:rPr>
+                <w:rFonts w:ascii="Arakom" w:cs="Arakom" w:eastAsia="Arakom" w:hAnsi="Arakom"/>
+                <w:b w:val="false"/>
+                <w:color w:val="000000"/>
+                <w:sz w:val="26"/>
+                <w:szCs w:val="26"/>
+                <w:rtl/>
+                <w:lang w:bidi="ar-SA"/>
+              </w:rPr>
+              <w:t xml:space="preserve"> مَدينَة زارَ خالِد؟</w:t>
             </w:r>
           </w:p>
           <w:p>

</xml_diff>